<commit_message>
Update CLM marketing: registration page (1-based challenges + cross-industry Business Impact) and README pptx name
Co-authored-by: Copilot App <223556219+Copilot@users.noreply.github.com>
Copilot-Session: 2fc86db1-1f76-4b83-b234-329556a5f335
</commit_message>
<xml_diff>
--- a/03-Azure/01-04-AI/04_Agentic_Contract_Lifecycle_Management/docs/marketing/BuildAIHack_regpage_CLM.docx
+++ b/03-Azure/01-04-AI/04_Agentic_Contract_Lifecycle_Management/docs/marketing/BuildAIHack_regpage_CLM.docx
@@ -133,6 +133,26 @@
       </w:r>
       <w:r>
         <w:t xml:space="preserve">Learn to design intelligent agents that draft from approved templates, extract and risk-score contract clauses, answer cited questions over a corpus, and proactively alert on renewals — always with human sign-off.</w:t>
+      </w:r>
+    </w:p>
+    <w:p>
+      <w:pPr>
+        <w:pStyle w:val="ListParagraph"/>
+        <w:numPr>
+          <w:ilvl w:val="0"/>
+          <w:numId w:val="2"/>
+        </w:numPr>
+        <w:spacing w:after="80"/>
+      </w:pPr>
+      <w:r>
+        <w:rPr>
+          <w:b/>
+          <w:bCs/>
+        </w:rPr>
+        <w:t xml:space="preserve">Business Impact: </w:t>
+      </w:r>
+      <w:r>
+        <w:t xml:space="preserve">See how agentic CLM compresses cycle time, cuts rework and outside-counsel spend, and stops revenue leakage from missed renewals — measurable outcomes that translate across any industry with high-volume, document-heavy workflows, not just legal or financial services.</w:t>
       </w:r>
     </w:p>
     <w:p>
@@ -422,7 +442,7 @@
           <w:b/>
           <w:bCs/>
         </w:rPr>
-        <w:t xml:space="preserve">Challenge 0 — </w:t>
+        <w:t xml:space="preserve">Challenge 1 — </w:t>
       </w:r>
       <w:r>
         <w:t xml:space="preserve">Setup &amp; Foundry Foundations</w:t>
@@ -442,7 +462,7 @@
           <w:b/>
           <w:bCs/>
         </w:rPr>
-        <w:t xml:space="preserve">Challenge 1 — </w:t>
+        <w:t xml:space="preserve">Challenge 2 — </w:t>
       </w:r>
       <w:r>
         <w:t xml:space="preserve">Grounded Agent with Foundry IQ + Tools</w:t>
@@ -462,7 +482,7 @@
           <w:b/>
           <w:bCs/>
         </w:rPr>
-        <w:t xml:space="preserve">Challenge 2 — </w:t>
+        <w:t xml:space="preserve">Challenge 3 — </w:t>
       </w:r>
       <w:r>
         <w:t xml:space="preserve">Observability, Tracing &amp; Evaluation</w:t>
@@ -482,7 +502,7 @@
           <w:b/>
           <w:bCs/>
         </w:rPr>
-        <w:t xml:space="preserve">Challenge 3 — </w:t>
+        <w:t xml:space="preserve">Challenge 4 — </w:t>
       </w:r>
       <w:r>
         <w:t xml:space="preserve">Orchestration + MCP Server</w:t>
@@ -502,7 +522,7 @@
           <w:b/>
           <w:bCs/>
         </w:rPr>
-        <w:t xml:space="preserve">Challenge 4 — </w:t>
+        <w:t xml:space="preserve">Challenge 5 — </w:t>
       </w:r>
       <w:r>
         <w:t xml:space="preserve">Publish to Microsoft 365 Copilot &amp; Teams + Proactive Alerts</w:t>
@@ -522,7 +542,7 @@
           <w:b/>
           <w:bCs/>
         </w:rPr>
-        <w:t xml:space="preserve">Bonus Challenge 5 (optional) — </w:t>
+        <w:t xml:space="preserve">Bonus Challenge 6 (optional) — </w:t>
       </w:r>
       <w:r>
         <w:t xml:space="preserve">Safety, Red-Teaming &amp; Continuous Evaluation</w:t>
@@ -789,7 +809,7 @@
           </w:tcPr>
           <w:p>
             <w:r>
-              <w:t xml:space="preserve">Hack challenges 0, 1 &amp; 2 (with a coffee break in between)</w:t>
+              <w:t xml:space="preserve">Hack challenges 1, 2 &amp; 3 (with a coffee break in between)</w:t>
             </w:r>
           </w:p>
         </w:tc>
@@ -909,7 +929,7 @@
           </w:tcPr>
           <w:p>
             <w:r>
-              <w:t xml:space="preserve">Hack challenges 3 &amp; 4</w:t>
+              <w:t xml:space="preserve">Hack challenges 4 &amp; 5</w:t>
             </w:r>
           </w:p>
         </w:tc>
@@ -1205,6 +1225,26 @@
       </w:r>
       <w:r>
         <w:t xml:space="preserve">Learn to design intelligent agents that draft from approved templates, extract and risk-score contract clauses, answer cited questions over a corpus, and proactively alert on renewals — always with human sign-off.</w:t>
+      </w:r>
+    </w:p>
+    <w:p>
+      <w:pPr>
+        <w:pStyle w:val="ListParagraph"/>
+        <w:numPr>
+          <w:ilvl w:val="0"/>
+          <w:numId w:val="2"/>
+        </w:numPr>
+        <w:spacing w:after="80"/>
+      </w:pPr>
+      <w:r>
+        <w:rPr>
+          <w:b/>
+          <w:bCs/>
+        </w:rPr>
+        <w:t xml:space="preserve">Business Impact: </w:t>
+      </w:r>
+      <w:r>
+        <w:t xml:space="preserve">See how agentic CLM compresses cycle time, cuts rework and outside-counsel spend, and stops revenue leakage from missed renewals — measurable outcomes that translate across any industry with high-volume, document-heavy workflows, not just legal or financial services.</w:t>
       </w:r>
     </w:p>
     <w:p>

</xml_diff>